<commit_message>
docs: polish final manuscript pagination
</commit_message>
<xml_diff>
--- a/paper/CXT-Fish_IMTS_Submission_Ready_v2.docx
+++ b/paper/CXT-Fish_IMTS_Submission_Ready_v2.docx
@@ -10656,7 +10656,7 @@
     <w:p>
       <w:pPr>
         <w:pStyle w:val="Heading1"/>
-        <w:keepNext/>
+        <w:keepNext w:val="0"/>
         <w:widowControl w:val="1"/>
       </w:pPr>
       <w:r>
@@ -10665,6 +10665,7 @@
     </w:p>
     <w:p>
       <w:pPr>
+        <w:pageBreakBefore/>
         <w:widowControl w:val="1"/>
       </w:pPr>
       <w:r>
@@ -10675,7 +10676,6 @@
       <w:pPr>
         <w:spacing w:before="100" w:after="40"/>
         <w:keepNext/>
-        <w:pageBreakBefore/>
         <w:widowControl w:val="1"/>
       </w:pPr>
       <w:r>

</xml_diff>